<commit_message>
update environmental impact considerations
</commit_message>
<xml_diff>
--- a/docs/outputs_management_plan.docx
+++ b/docs/outputs_management_plan.docx
@@ -23,10 +23,10 @@
         <w:pStyle w:val="Date"/>
       </w:pPr>
       <w:r>
-        <w:t xml:space="preserve">March 31, 2026</w:t>
-      </w:r>
-    </w:p>
-    <w:bookmarkStart w:id="20" w:name="output-summary"/>
+        <w:t xml:space="preserve">May 15, 2026</w:t>
+      </w:r>
+    </w:p>
+    <w:bookmarkStart w:id="9" w:name="output-summary"/>
     <w:p>
       <w:pPr>
         <w:pStyle w:val="Heading2"/>
@@ -215,8 +215,8 @@
         <w:t xml:space="preserve">These outputs are related to the goals of the project: to engage people in contributing to the development of R; maintain and improve infrastructure supporting the development of R and facilitating contribution; improve communication and governance.</w:t>
       </w:r>
     </w:p>
-    <w:bookmarkEnd w:id="20"/>
-    <w:bookmarkStart w:id="21" w:name="data-collection"/>
+    <w:bookmarkEnd w:id="9"/>
+    <w:bookmarkStart w:id="10" w:name="data-collection"/>
     <w:p>
       <w:pPr>
         <w:pStyle w:val="Heading2"/>
@@ -241,8 +241,8 @@
         <w:t xml:space="preserve">We will obtain consent to use data for additional purposes, e.g. to use photos in reports of events or to add email addresses to a contact list for sharing announcements of future events.</w:t>
       </w:r>
     </w:p>
-    <w:bookmarkEnd w:id="21"/>
-    <w:bookmarkStart w:id="22" w:name="data-storage"/>
+    <w:bookmarkEnd w:id="10"/>
+    <w:bookmarkStart w:id="11" w:name="data-storage"/>
     <w:p>
       <w:pPr>
         <w:pStyle w:val="Heading2"/>
@@ -259,8 +259,8 @@
         <w:t xml:space="preserve">We will use the R Contributors pretix.eu instance for registration and the R Foundation LimeSurvey instance for application forms, both cloud-hosted on servers in the EU. Exported data will be stored on the University of Birmingham OneDrive of the data manager, in password protected files. Subsets of the data will be shared with specific organisers/administrators as required, separating out the data that is strictly necessary for the purpose. Event data will be stored until 6 months after the event, after which only participant lists and demographic summaries will be kept, plus the data (photos, emails) where consent has been given for further use.</w:t>
       </w:r>
     </w:p>
-    <w:bookmarkEnd w:id="22"/>
-    <w:bookmarkStart w:id="23" w:name="output-storage"/>
+    <w:bookmarkEnd w:id="11"/>
+    <w:bookmarkStart w:id="12" w:name="output-storage"/>
     <w:p>
       <w:pPr>
         <w:pStyle w:val="Heading2"/>
@@ -277,8 +277,8 @@
         <w:t xml:space="preserve">Code and technical documentation will be version-controlled so that local copies are backed up in remote repositories, which will usually be public repositories under the R-devel GitHub organisation on GitHub. Notes and proposals will often be drafted in private first, stored locally with a secure backup, such as a university-managed OneDrive.</w:t>
       </w:r>
     </w:p>
-    <w:bookmarkEnd w:id="23"/>
-    <w:bookmarkStart w:id="24" w:name="output-sharing"/>
+    <w:bookmarkEnd w:id="12"/>
+    <w:bookmarkStart w:id="13" w:name="output-sharing"/>
     <w:p>
       <w:pPr>
         <w:pStyle w:val="Heading2"/>
@@ -407,8 +407,8 @@
         <w:t xml:space="preserve">The outputs will be shared as soon as they are ready – often they will be shared during the process of development so that interested parties can follow development and give feedback, e.g. via commenting on a GitHub issue. Some outputs, e.g. a patch fixing a bug, or a blog post, may not need further update. For other outputs we will balance work on updates against other planned work, prioritising activity with greater impact.</w:t>
       </w:r>
     </w:p>
-    <w:bookmarkEnd w:id="24"/>
-    <w:bookmarkStart w:id="25" w:name="X69cbccb66cffdd7b6b17847586f098a41943c26"/>
+    <w:bookmarkEnd w:id="13"/>
+    <w:bookmarkStart w:id="14" w:name="X69cbccb66cffdd7b6b17847586f098a41943c26"/>
     <w:p>
       <w:pPr>
         <w:pStyle w:val="Heading2"/>
@@ -424,9 +424,11 @@
       <w:r>
         <w:t xml:space="preserve">We will ensure that the data collection and processing for event organisation is GDPR compliant.</w:t>
       </w:r>
-      <w:r>
-        <w:t xml:space="preserve"> </w:t>
-      </w:r>
+    </w:p>
+    <w:p>
+      <w:pPr>
+        <w:pStyle w:val="BodyText"/>
+      </w:pPr>
       <w:r>
         <w:t xml:space="preserve">Some work on this project may involve the use of AI (large language models). This will be done in a responsible way, with team members or collaborators overseeing the process: creating prompts, reviewing outputs, editing outputs directly or interacting with the AI to correct or refine outputs, and validating any code produced. By keeping a human in the loop, outputs will be copyrightable and suitable for release under an open source license. Authors will be expected to understand all code/documentation that they will maintain. Code contributed to open source projects should be well tested; authors and code reviewers should ensure that at least as a team they understand each line of code in the contribution.</w:t>
       </w:r>
@@ -436,10 +438,10 @@
         <w:pStyle w:val="BodyText"/>
       </w:pPr>
       <w:r>
-        <w:t xml:space="preserve">Large language models have a high environmental impact, therefore we will encourage team members to use AI in moderation and to consider if alternative approaches can achieve similar results. Another area with potentially high environmental cost is automated testing. Team members will be asked to record activities with heavy computational cost, so that we can consider both the value of these activities and how the cost may be minimised.</w:t>
-      </w:r>
-    </w:p>
-    <w:bookmarkEnd w:id="25"/>
+        <w:t xml:space="preserve">Large language models have a high environmental impact, therefore we will encourage team members to use AI in moderation and to consider if alternative approaches can achieve similar results. Another area with potentially high environmental cost is automated testing. The environment impact of computational activities may be outweighed by the impact of team members flying to attend related events. Team members will be asked to flag activities with potentially high environmental cost, consider whether the cost is justified (essential to the goals of the project) and what if any mitigations can be made to minimise the environmental impact.</w:t>
+      </w:r>
+    </w:p>
+    <w:bookmarkEnd w:id="14"/>
     <w:sectPr>
       <w:footnotePr>
         <w:numRestart w:val="eachSect"/>
@@ -673,10 +675,10 @@
   <w:docDefaults>
     <w:rPrDefault>
       <w:rPr>
-        <w:rFonts w:asciiTheme="minorHAnsi" w:cstheme="minorBidi" w:eastAsiaTheme="minorHAnsi" w:hAnsiTheme="minorHAnsi"/>
+        <w:rFonts w:asciiTheme="minorHAnsi" w:cstheme="minorBidi" w:eastAsiaTheme="minorEastAsia" w:hAnsiTheme="minorHAnsi"/>
         <w:sz w:val="24"/>
         <w:szCs w:val="24"/>
-        <w:lang w:bidi="ar-SA" w:eastAsia="en-US" w:val="en-US"/>
+        <w:lang w:bidi="ar-SA" w:eastAsia="zh-CN" w:val="en-US"/>
       </w:rPr>
     </w:rPrDefault>
     <w:pPrDefault>
@@ -1217,13 +1219,6 @@
       </w:tblCellMar>
     </w:tblPr>
     <w:tblStylePr w:type="firstRow">
-      <w:tblPr>
-        <w:jc w:val="left"/>
-        <w:tblInd w:type="dxa" w:w="0"/>
-      </w:tblPr>
-      <w:trPr>
-        <w:jc w:val="left"/>
-      </w:trPr>
       <w:tcPr>
         <w:tcBorders>
           <w:bottom w:val="single"/>

</xml_diff>